<commit_message>
Fix: EFH + MFH Standort Bünde (nicht Herford)
Co-Authored-By: Claude Opus 4.6 <noreply@anthropic.com>
</commit_message>
<xml_diff>
--- a/Finanzierungsuebersicht_Reichenau.docx
+++ b/Finanzierungsuebersicht_Reichenau.docx
@@ -684,7 +684,7 @@
               <w:rPr>
                 <w:sz w:val="20"/>
               </w:rPr>
-              <w:t>Einfamilienhaus (Herford)</w:t>
+              <w:t>Einfamilienhaus (Bünde)</w:t>
             </w:r>
           </w:p>
         </w:tc>
@@ -743,7 +743,7 @@
               <w:rPr>
                 <w:sz w:val="20"/>
               </w:rPr>
-              <w:t>MFH 5 WE (Herford)</w:t>
+              <w:t>MFH 5 WE (Bünde)</w:t>
             </w:r>
           </w:p>
         </w:tc>
@@ -1079,7 +1079,7 @@
         <w:rPr>
           <w:sz w:val="21"/>
         </w:rPr>
-        <w:t>Wir möchten die freien Grundschuldanteile unserer Bestandsobjekte (EFH + MFH in Herford) als Zusatzsicherheit einbringen, um die Eigenkapitalanforderung von 111.000 € zu reduzieren. Der Gesamt-Beleihungsauslauf bleibt mit unter 70 % auf einem konservativen Niveau.</w:t>
+        <w:t>Wir möchten die freien Grundschuldanteile unserer Bestandsobjekte (EFH + MFH in Bünde) als Zusatzsicherheit einbringen, um die Eigenkapitalanforderung von 111.000 € zu reduzieren. Der Gesamt-Beleihungsauslauf bleibt mit unter 70 % auf einem konservativen Niveau.</w:t>
       </w:r>
     </w:p>
     <w:p/>

</xml_diff>

<commit_message>
Expertenkorrektur: Denkmal-AfA, §21 Mietverhältnis, Hausgeld, Formatierung
Co-Authored-By: Claude Opus 4.6 <noreply@anthropic.com>
</commit_message>
<xml_diff>
--- a/Finanzierungsuebersicht_Reichenau.docx
+++ b/Finanzierungsuebersicht_Reichenau.docx
@@ -24,7 +24,7 @@
           <w:color w:val="555555"/>
           <w:sz w:val="24"/>
         </w:rPr>
-        <w:t>Objekt 2025-KN-1578.Klosterinsel Reichenau, Konstanz</w:t>
+        <w:t>Objekt 2025-KN-1578, Klosterinsel Reichenau, Konstanz</w:t>
       </w:r>
     </w:p>
     <w:p/>
@@ -328,7 +328,7 @@
               <w:rPr>
                 <w:sz w:val="20"/>
               </w:rPr>
-              <w:t>Vermietung (Familie, marktübliche Miete)</w:t>
+              <w:t>Vermietung (Familie, mind. 66 % der ortsüblichen Vergleichsmiete gem. §21 Abs. 2 EStG)</w:t>
             </w:r>
           </w:p>
         </w:tc>
@@ -391,6 +391,68 @@
                 <w:sz w:val="20"/>
               </w:rPr>
               <w:t>1 Kfz-Stellplatz im Freien</w:t>
+            </w:r>
+          </w:p>
+        </w:tc>
+      </w:tr>
+      <w:tr>
+        <w:tc>
+          <w:tcPr>
+            <w:tcW w:type="dxa" w:w="2835"/>
+          </w:tcPr>
+          <w:p>
+            <w:r/>
+            <w:r>
+              <w:rPr>
+                <w:sz w:val="20"/>
+              </w:rPr>
+              <w:t>Hausgeld / WEG-Kosten</w:t>
+            </w:r>
+          </w:p>
+        </w:tc>
+        <w:tc>
+          <w:tcPr>
+            <w:tcW w:type="dxa" w:w="6236"/>
+          </w:tcPr>
+          <w:p>
+            <w:r/>
+            <w:r>
+              <w:rPr>
+                <w:sz w:val="20"/>
+              </w:rPr>
+              <w:t>Wird beim Verkäufer angefragt (inkl. Instandhaltungsrücklage)</w:t>
+            </w:r>
+          </w:p>
+        </w:tc>
+      </w:tr>
+      <w:tr>
+        <w:tc>
+          <w:tcPr>
+            <w:tcW w:type="dxa" w:w="2835"/>
+            <w:shd w:fill="f0f4fa" w:val="clear"/>
+          </w:tcPr>
+          <w:p>
+            <w:r/>
+            <w:r>
+              <w:rPr>
+                <w:sz w:val="20"/>
+              </w:rPr>
+              <w:t>Teilungserklärung</w:t>
+            </w:r>
+          </w:p>
+        </w:tc>
+        <w:tc>
+          <w:tcPr>
+            <w:tcW w:type="dxa" w:w="6236"/>
+            <w:shd w:fill="f0f4fa" w:val="clear"/>
+          </w:tcPr>
+          <w:p>
+            <w:r/>
+            <w:r>
+              <w:rPr>
+                <w:sz w:val="20"/>
+              </w:rPr>
+              <w:t>Wird beim Verkäufer angefragt</w:t>
             </w:r>
           </w:p>
         </w:tc>
@@ -587,7 +649,7 @@
           <w:color w:val="1A3C6E"/>
           <w:sz w:val="26"/>
         </w:rPr>
-        <w:t>3. Gesamtportfolio.Sicherheitenübersicht</w:t>
+        <w:t>3. Gesamtportfolio / Sicherheitenübersicht</w:t>
       </w:r>
     </w:p>
     <w:tbl>
@@ -941,7 +1003,7 @@
           <w:color w:val="555555"/>
           <w:sz w:val="21"/>
         </w:rPr>
-        <w:t>Deutlich unter der 80 %-Schwelle.konservatives Risikoprofil</w:t>
+        <w:t>Deutlich unter der 80 %-Schwelle, konservatives Risikoprofil</w:t>
       </w:r>
     </w:p>
     <w:p/>
@@ -970,7 +1032,7 @@
         <w:rPr>
           <w:sz w:val="21"/>
         </w:rPr>
-        <w:t>Sanierungskosten zu 100 % absetzbar über 12 Jahre.verbessert den Netto-Cashflow erheblich</w:t>
+        <w:t>Sanierungskosten nach Erwerb über 12 Jahre absetzbar (9 % p.a. für 8 Jahre, 7 % p.a. für 4 Jahre). Zusätzlich reguläre Gebäude-AfA auf den Kaufpreisanteil. Verbessert den Netto-Cashflow erheblich.</w:t>
       </w:r>
     </w:p>
     <w:p>
@@ -988,7 +1050,7 @@
         <w:rPr>
           <w:sz w:val="21"/>
         </w:rPr>
-        <w:t>Einer der stabilsten Immobilienmärkte Deutschlands, UNESCO-Welterbe, Grenznähe Schweiz.minimales Wertminderungsrisiko</w:t>
+        <w:t>Einer der stabilsten Immobilienmärkte Deutschlands, UNESCO-Welterbe, Grenznähe Schweiz. Minimales Wertminderungsrisiko.</w:t>
       </w:r>
     </w:p>
     <w:p>
@@ -1006,7 +1068,7 @@
         <w:rPr>
           <w:sz w:val="21"/>
         </w:rPr>
-        <w:t>Pelletheizung Bj. 2023 + Photovoltaik.geringe Betriebskosten, zukunftssicher</w:t>
+        <w:t>Pelletheizung Bj. 2023 + Photovoltaik. Geringe Betriebskosten, zukunftssicher.</w:t>
       </w:r>
     </w:p>
     <w:p>

</xml_diff>

<commit_message>
Korrektur: MFH Wertindikation (510k Marktwert, 381k Beleihungswert), Standort Herford
Co-Authored-By: Claude Opus 4.6 <noreply@anthropic.com>
</commit_message>
<xml_diff>
--- a/Finanzierungsuebersicht_Reichenau.docx
+++ b/Finanzierungsuebersicht_Reichenau.docx
@@ -805,7 +805,7 @@
               <w:rPr>
                 <w:sz w:val="20"/>
               </w:rPr>
-              <w:t>MFH 5 WE (Bünde)</w:t>
+              <w:t>MFH Rennstr. 4a (Herford)</w:t>
             </w:r>
           </w:p>
         </w:tc>
@@ -820,7 +820,7 @@
               <w:rPr>
                 <w:sz w:val="20"/>
               </w:rPr>
-              <w:t>550.000 €</w:t>
+              <w:t>510.000 €</w:t>
             </w:r>
           </w:p>
         </w:tc>
@@ -835,7 +835,7 @@
               <w:rPr>
                 <w:sz w:val="20"/>
               </w:rPr>
-              <w:t>385.000 €</w:t>
+              <w:t>381.000 €</w:t>
             </w:r>
           </w:p>
         </w:tc>
@@ -850,7 +850,7 @@
               <w:rPr>
                 <w:sz w:val="20"/>
               </w:rPr>
-              <w:t>165.000 €</w:t>
+              <w:t>129.000 €</w:t>
             </w:r>
           </w:p>
         </w:tc>
@@ -942,7 +942,7 @@
                 <w:b/>
                 <w:sz w:val="20"/>
               </w:rPr>
-              <w:t>1.389.000 €</w:t>
+              <w:t>1.349.000 €</w:t>
             </w:r>
           </w:p>
         </w:tc>
@@ -958,7 +958,7 @@
                 <w:b/>
                 <w:sz w:val="20"/>
               </w:rPr>
-              <w:t>970.100 €</w:t>
+              <w:t>966.100 €</w:t>
             </w:r>
           </w:p>
         </w:tc>
@@ -974,7 +974,7 @@
                 <w:b/>
                 <w:sz w:val="20"/>
               </w:rPr>
-              <w:t>365.000 €</w:t>
+              <w:t>329.000 €</w:t>
             </w:r>
           </w:p>
         </w:tc>
@@ -991,7 +991,7 @@
           <w:color w:val="0A7A2A"/>
           <w:sz w:val="28"/>
         </w:rPr>
-        <w:t>Gesamt-Beleihungsauslauf: 69,8 %</w:t>
+        <w:t>Gesamt-Beleihungsauslauf: 71,6 %</w:t>
       </w:r>
     </w:p>
     <w:p>
@@ -1003,7 +1003,7 @@
           <w:color w:val="555555"/>
           <w:sz w:val="21"/>
         </w:rPr>
-        <w:t>Deutlich unter der 80 %-Schwelle, konservatives Risikoprofil</w:t>
+        <w:t>Unter der 80 %-Schwelle, konservatives Risikoprofil</w:t>
       </w:r>
     </w:p>
     <w:p/>
@@ -1116,7 +1116,7 @@
           <w:b/>
           <w:sz w:val="21"/>
         </w:rPr>
-        <w:t xml:space="preserve">365.000 € freie Sicherheiten </w:t>
+        <w:t xml:space="preserve">329.000 € freie Sicherheiten </w:t>
       </w:r>
       <w:r>
         <w:rPr>
@@ -1141,7 +1141,7 @@
         <w:rPr>
           <w:sz w:val="21"/>
         </w:rPr>
-        <w:t>Wir möchten die freien Grundschuldanteile unserer Bestandsobjekte (EFH + MFH in Bünde) als Zusatzsicherheit einbringen, um die Eigenkapitalanforderung von 111.000 € zu reduzieren. Der Gesamt-Beleihungsauslauf bleibt mit unter 70 % auf einem konservativen Niveau.</w:t>
+        <w:t>Wir möchten die freien Grundschuldanteile unserer Bestandsobjekte (EFH in Bünde + MFH in Herford) als Zusatzsicherheit einbringen, um dieEigenkapitalanforderung von 111.000 € zu reduzieren. Der Gesamt-Beleihungsauslauf bleibt mit unter 72 % auf einem konservativen Niveau.</w:t>
       </w:r>
     </w:p>
     <w:p/>

</xml_diff>

<commit_message>
Final: MFH lastenfrei, Kaufnebenkosten, Mietquelle, LTV 43,4%
Co-Authored-By: Claude Opus 4.6 <noreply@anthropic.com>
</commit_message>
<xml_diff>
--- a/Finanzierungsuebersicht_Reichenau.docx
+++ b/Finanzierungsuebersicht_Reichenau.docx
@@ -466,7 +466,222 @@
           <w:color w:val="1A3C6E"/>
           <w:sz w:val="26"/>
         </w:rPr>
-        <w:t>2. Erwartete Mieteinnahmen</w:t>
+        <w:t>2. Kaufnebenkosten</w:t>
+      </w:r>
+    </w:p>
+    <w:tbl>
+      <w:tblPr>
+        <w:tblStyle w:val="TableGrid"/>
+        <w:tblW w:type="auto" w:w="0"/>
+        <w:jc w:val="center"/>
+        <w:tblLook w:firstColumn="1" w:firstRow="1" w:lastColumn="0" w:lastRow="0" w:noHBand="0" w:noVBand="1" w:val="04A0"/>
+      </w:tblPr>
+      <w:tblGrid>
+        <w:gridCol w:w="4703"/>
+        <w:gridCol w:w="4703"/>
+      </w:tblGrid>
+      <w:tr>
+        <w:tc>
+          <w:tcPr>
+            <w:tcW w:type="dxa" w:w="5102"/>
+            <w:shd w:fill="1a3c6e" w:val="clear"/>
+          </w:tcPr>
+          <w:p>
+            <w:r/>
+            <w:r>
+              <w:rPr>
+                <w:b/>
+                <w:color w:val="FFFFFF"/>
+                <w:sz w:val="20"/>
+              </w:rPr>
+              <w:t>Position</w:t>
+            </w:r>
+          </w:p>
+        </w:tc>
+        <w:tc>
+          <w:tcPr>
+            <w:tcW w:type="dxa" w:w="3969"/>
+            <w:shd w:fill="1a3c6e" w:val="clear"/>
+          </w:tcPr>
+          <w:p>
+            <w:r/>
+            <w:r>
+              <w:rPr>
+                <w:b/>
+                <w:color w:val="FFFFFF"/>
+                <w:sz w:val="20"/>
+              </w:rPr>
+              <w:t>Betrag</w:t>
+            </w:r>
+          </w:p>
+        </w:tc>
+      </w:tr>
+      <w:tr>
+        <w:tc>
+          <w:tcPr>
+            <w:tcW w:type="dxa" w:w="5102"/>
+          </w:tcPr>
+          <w:p>
+            <w:r/>
+            <w:r>
+              <w:rPr>
+                <w:sz w:val="20"/>
+              </w:rPr>
+              <w:t>Grunderwerbsteuer (5,0 % BaWü)</w:t>
+            </w:r>
+          </w:p>
+        </w:tc>
+        <w:tc>
+          <w:tcPr>
+            <w:tcW w:type="dxa" w:w="3969"/>
+          </w:tcPr>
+          <w:p>
+            <w:r/>
+            <w:r>
+              <w:rPr>
+                <w:sz w:val="20"/>
+              </w:rPr>
+              <w:t>26.950 €</w:t>
+            </w:r>
+          </w:p>
+        </w:tc>
+      </w:tr>
+      <w:tr>
+        <w:tc>
+          <w:tcPr>
+            <w:tcW w:type="dxa" w:w="5102"/>
+            <w:shd w:fill="f0f4fa" w:val="clear"/>
+          </w:tcPr>
+          <w:p>
+            <w:r/>
+            <w:r>
+              <w:rPr>
+                <w:sz w:val="20"/>
+              </w:rPr>
+              <w:t>Maklerprovision (3,57 % inkl. MwSt.)</w:t>
+            </w:r>
+          </w:p>
+        </w:tc>
+        <w:tc>
+          <w:tcPr>
+            <w:tcW w:type="dxa" w:w="3969"/>
+            <w:shd w:fill="f0f4fa" w:val="clear"/>
+          </w:tcPr>
+          <w:p>
+            <w:r/>
+            <w:r>
+              <w:rPr>
+                <w:sz w:val="20"/>
+              </w:rPr>
+              <w:t>19.242 €</w:t>
+            </w:r>
+          </w:p>
+        </w:tc>
+      </w:tr>
+      <w:tr>
+        <w:tc>
+          <w:tcPr>
+            <w:tcW w:type="dxa" w:w="5102"/>
+          </w:tcPr>
+          <w:p>
+            <w:r/>
+            <w:r>
+              <w:rPr>
+                <w:sz w:val="20"/>
+              </w:rPr>
+              <w:t>Notar + Grundbuch (ca. 1,7 %)</w:t>
+            </w:r>
+          </w:p>
+        </w:tc>
+        <w:tc>
+          <w:tcPr>
+            <w:tcW w:type="dxa" w:w="3969"/>
+          </w:tcPr>
+          <w:p>
+            <w:r/>
+            <w:r>
+              <w:rPr>
+                <w:sz w:val="20"/>
+              </w:rPr>
+              <w:t>9.163 €</w:t>
+            </w:r>
+          </w:p>
+        </w:tc>
+      </w:tr>
+      <w:tr>
+        <w:tc>
+          <w:tcPr>
+            <w:tcW w:type="dxa" w:w="5102"/>
+            <w:shd w:fill="f0f4fa" w:val="clear"/>
+          </w:tcPr>
+          <w:p>
+            <w:r/>
+            <w:r>
+              <w:rPr>
+                <w:sz w:val="20"/>
+              </w:rPr>
+              <w:t>Gesamt Nebenkosten</w:t>
+            </w:r>
+          </w:p>
+        </w:tc>
+        <w:tc>
+          <w:tcPr>
+            <w:tcW w:type="dxa" w:w="3969"/>
+            <w:shd w:fill="f0f4fa" w:val="clear"/>
+          </w:tcPr>
+          <w:p>
+            <w:r/>
+            <w:r>
+              <w:rPr>
+                <w:sz w:val="20"/>
+              </w:rPr>
+              <w:t>55.355 €</w:t>
+            </w:r>
+          </w:p>
+        </w:tc>
+      </w:tr>
+      <w:tr>
+        <w:tc>
+          <w:tcPr>
+            <w:tcW w:type="dxa" w:w="5102"/>
+          </w:tcPr>
+          <w:p>
+            <w:r/>
+            <w:r>
+              <w:rPr>
+                <w:b/>
+                <w:sz w:val="20"/>
+              </w:rPr>
+              <w:t>Gesamter Finanzierungsbedarf</w:t>
+            </w:r>
+          </w:p>
+        </w:tc>
+        <w:tc>
+          <w:tcPr>
+            <w:tcW w:type="dxa" w:w="3969"/>
+          </w:tcPr>
+          <w:p>
+            <w:r/>
+            <w:r>
+              <w:rPr>
+                <w:b/>
+                <w:sz w:val="20"/>
+              </w:rPr>
+              <w:t>594.355 €</w:t>
+            </w:r>
+          </w:p>
+        </w:tc>
+      </w:tr>
+    </w:tbl>
+    <w:p/>
+    <w:p>
+      <w:r>
+        <w:rPr>
+          <w:b/>
+          <w:color w:val="1A3C6E"/>
+          <w:sz w:val="26"/>
+        </w:rPr>
+        <w:t>3. Erwartete Mieteinnahmen</w:t>
       </w:r>
     </w:p>
     <w:tbl>
@@ -541,7 +756,7 @@
               <w:rPr>
                 <w:sz w:val="20"/>
               </w:rPr>
-              <w:t>ca. 13 bis 15 €/m²</w:t>
+              <w:t>ca. 13 bis 15 €/m² (Quelle: ImmoScout24 Vergleichsangebote)</w:t>
             </w:r>
           </w:p>
         </w:tc>
@@ -649,7 +864,7 @@
           <w:color w:val="1A3C6E"/>
           <w:sz w:val="26"/>
         </w:rPr>
-        <w:t>3. Gesamtportfolio / Sicherheitenübersicht</w:t>
+        <w:t>4. Gesamtportfolio / Sicherheitenübersicht</w:t>
       </w:r>
     </w:p>
     <w:tbl>
@@ -760,7 +975,7 @@
               <w:rPr>
                 <w:sz w:val="20"/>
               </w:rPr>
-              <w:t>300.000 €</w:t>
+              <w:t>300.000 € (Schätzwert)</w:t>
             </w:r>
           </w:p>
         </w:tc>
@@ -774,7 +989,7 @@
               <w:rPr>
                 <w:sz w:val="20"/>
               </w:rPr>
-              <w:t>100.000 €</w:t>
+              <w:t>ca. 100.000 €</w:t>
             </w:r>
           </w:p>
         </w:tc>
@@ -820,7 +1035,7 @@
               <w:rPr>
                 <w:sz w:val="20"/>
               </w:rPr>
-              <w:t>510.000 €</w:t>
+              <w:t>510.000 € (Sprengnetter)</w:t>
             </w:r>
           </w:p>
         </w:tc>
@@ -835,7 +1050,7 @@
               <w:rPr>
                 <w:sz w:val="20"/>
               </w:rPr>
-              <w:t>381.000 €</w:t>
+              <w:t>0 €</w:t>
             </w:r>
           </w:p>
         </w:tc>
@@ -850,7 +1065,7 @@
               <w:rPr>
                 <w:sz w:val="20"/>
               </w:rPr>
-              <w:t>129.000 €</w:t>
+              <w:t>510.000 €</w:t>
             </w:r>
           </w:p>
         </w:tc>
@@ -958,7 +1173,7 @@
                 <w:b/>
                 <w:sz w:val="20"/>
               </w:rPr>
-              <w:t>966.100 €</w:t>
+              <w:t>585.100 €</w:t>
             </w:r>
           </w:p>
         </w:tc>
@@ -974,7 +1189,7 @@
                 <w:b/>
                 <w:sz w:val="20"/>
               </w:rPr>
-              <w:t>329.000 €</w:t>
+              <w:t>710.000 €</w:t>
             </w:r>
           </w:p>
         </w:tc>
@@ -991,7 +1206,7 @@
           <w:color w:val="0A7A2A"/>
           <w:sz w:val="28"/>
         </w:rPr>
-        <w:t>Gesamt-Beleihungsauslauf: 71,6 %</w:t>
+        <w:t>Gesamt-Beleihungsauslauf: 43,4 %</w:t>
       </w:r>
     </w:p>
     <w:p>
@@ -1003,7 +1218,7 @@
           <w:color w:val="555555"/>
           <w:sz w:val="21"/>
         </w:rPr>
-        <w:t>Unter der 80 %-Schwelle, konservatives Risikoprofil</w:t>
+        <w:t>Deutlich unter der 60 %-Schwelle, sehr konservatives Risikoprofil</w:t>
       </w:r>
     </w:p>
     <w:p/>
@@ -1014,7 +1229,7 @@
           <w:color w:val="1A3C6E"/>
           <w:sz w:val="26"/>
         </w:rPr>
-        <w:t>4. Risikobewertung</w:t>
+        <w:t>5. Risikobewertung</w:t>
       </w:r>
     </w:p>
     <w:p>
@@ -1116,13 +1331,13 @@
           <w:b/>
           <w:sz w:val="21"/>
         </w:rPr>
-        <w:t xml:space="preserve">329.000 € freie Sicherheiten </w:t>
+        <w:t xml:space="preserve">710.000 € freie Sicherheiten </w:t>
       </w:r>
       <w:r>
         <w:rPr>
           <w:sz w:val="21"/>
         </w:rPr>
-        <w:t>im Bestandsportfolio als Zusatzsicherheit verfügbar</w:t>
+        <w:t>im Bestandsportfolio als Zusatzsicherheit verfügbar (davon MFH Herford lastenfrei)</w:t>
       </w:r>
     </w:p>
     <w:p/>
@@ -1133,7 +1348,7 @@
           <w:color w:val="1A3C6E"/>
           <w:sz w:val="26"/>
         </w:rPr>
-        <w:t>5. Unser Vorschlag</w:t>
+        <w:t>6. Unser Vorschlag</w:t>
       </w:r>
     </w:p>
     <w:p>
@@ -1141,7 +1356,7 @@
         <w:rPr>
           <w:sz w:val="21"/>
         </w:rPr>
-        <w:t>Wir möchten die freien Grundschuldanteile unserer Bestandsobjekte (EFH in Bünde + MFH in Herford) als Zusatzsicherheit einbringen, um dieEigenkapitalanforderung von 111.000 € zu reduzieren. Der Gesamt-Beleihungsauslauf bleibt mit unter 72 % auf einem konservativen Niveau.</w:t>
+        <w:t>Wir möchten die freien Grundschuldanteile unserer Bestandsobjekte (EFH in Bünde + MFH in Herford) als Zusatzsicherheit einbringen, um die Eigenkapitalanforderung von 111.000 € zu reduzieren. Der Gesamt-Beleihungsauslauf bleibt mit unter 44 % auf einem sehr konservativen Niveau.</w:t>
       </w:r>
     </w:p>
     <w:p/>

</xml_diff>

<commit_message>
Korrektur: MFH Herford Restschuld ca. 74.000 EUR, LTV 48,9%
Co-Authored-By: Claude Opus 4.6 <noreply@anthropic.com>
</commit_message>
<xml_diff>
--- a/Finanzierungsuebersicht_Reichenau.docx
+++ b/Finanzierungsuebersicht_Reichenau.docx
@@ -1050,7 +1050,7 @@
               <w:rPr>
                 <w:sz w:val="20"/>
               </w:rPr>
-              <w:t>0 €</w:t>
+              <w:t>ca. 74.000 €</w:t>
             </w:r>
           </w:p>
         </w:tc>
@@ -1065,7 +1065,7 @@
               <w:rPr>
                 <w:sz w:val="20"/>
               </w:rPr>
-              <w:t>510.000 €</w:t>
+              <w:t>436.000 €</w:t>
             </w:r>
           </w:p>
         </w:tc>
@@ -1173,7 +1173,7 @@
                 <w:b/>
                 <w:sz w:val="20"/>
               </w:rPr>
-              <w:t>585.100 €</w:t>
+              <w:t>659.100 €</w:t>
             </w:r>
           </w:p>
         </w:tc>
@@ -1189,7 +1189,7 @@
                 <w:b/>
                 <w:sz w:val="20"/>
               </w:rPr>
-              <w:t>710.000 €</w:t>
+              <w:t>636.000 €</w:t>
             </w:r>
           </w:p>
         </w:tc>
@@ -1206,7 +1206,7 @@
           <w:color w:val="0A7A2A"/>
           <w:sz w:val="28"/>
         </w:rPr>
-        <w:t>Gesamt-Beleihungsauslauf: 43,4 %</w:t>
+        <w:t>Gesamt-Beleihungsauslauf: 48,9 %</w:t>
       </w:r>
     </w:p>
     <w:p>
@@ -1331,13 +1331,13 @@
           <w:b/>
           <w:sz w:val="21"/>
         </w:rPr>
-        <w:t xml:space="preserve">710.000 € freie Sicherheiten </w:t>
+        <w:t xml:space="preserve">636.000 € freie Sicherheiten </w:t>
       </w:r>
       <w:r>
         <w:rPr>
           <w:sz w:val="21"/>
         </w:rPr>
-        <w:t>im Bestandsportfolio als Zusatzsicherheit verfügbar (davon MFH Herford lastenfrei)</w:t>
+        <w:t>im Bestandsportfolio als Zusatzsicherheit verfügbar</w:t>
       </w:r>
     </w:p>
     <w:p/>
@@ -1356,7 +1356,7 @@
         <w:rPr>
           <w:sz w:val="21"/>
         </w:rPr>
-        <w:t>Wir möchten die freien Grundschuldanteile unserer Bestandsobjekte (EFH in Bünde + MFH in Herford) als Zusatzsicherheit einbringen, um die Eigenkapitalanforderung von 111.000 € zu reduzieren. Der Gesamt-Beleihungsauslauf bleibt mit unter 44 % auf einem sehr konservativen Niveau.</w:t>
+        <w:t>Wir möchten die freien Grundschuldanteile unserer Bestandsobjekte (EFH in Bünde + MFH in Herford) als Zusatzsicherheit einbringen, um die Eigenkapitalanforderung von 111.000 € zu reduzieren. Der Gesamt-Beleihungsauslauf bleibt mit unter 49 % auf einem sehr konservativen Niveau.</w:t>
       </w:r>
     </w:p>
     <w:p/>

</xml_diff>

<commit_message>
Korrektur: EFH 60k, MFH 74k Restschuld, LTV 45,9%
Co-Authored-By: Claude Opus 4.6 <noreply@anthropic.com>
</commit_message>
<xml_diff>
--- a/Finanzierungsuebersicht_Reichenau.docx
+++ b/Finanzierungsuebersicht_Reichenau.docx
@@ -989,7 +989,7 @@
               <w:rPr>
                 <w:sz w:val="20"/>
               </w:rPr>
-              <w:t>ca. 100.000 €</w:t>
+              <w:t>60.000 €</w:t>
             </w:r>
           </w:p>
         </w:tc>
@@ -1003,7 +1003,7 @@
               <w:rPr>
                 <w:sz w:val="20"/>
               </w:rPr>
-              <w:t>200.000 €</w:t>
+              <w:t>240.000 €</w:t>
             </w:r>
           </w:p>
         </w:tc>
@@ -1050,7 +1050,7 @@
               <w:rPr>
                 <w:sz w:val="20"/>
               </w:rPr>
-              <w:t>ca. 74.000 €</w:t>
+              <w:t>74.000 €</w:t>
             </w:r>
           </w:p>
         </w:tc>
@@ -1173,7 +1173,7 @@
                 <w:b/>
                 <w:sz w:val="20"/>
               </w:rPr>
-              <w:t>659.100 €</w:t>
+              <w:t>619.100 €</w:t>
             </w:r>
           </w:p>
         </w:tc>
@@ -1189,7 +1189,7 @@
                 <w:b/>
                 <w:sz w:val="20"/>
               </w:rPr>
-              <w:t>636.000 €</w:t>
+              <w:t>676.000 €</w:t>
             </w:r>
           </w:p>
         </w:tc>
@@ -1206,7 +1206,7 @@
           <w:color w:val="0A7A2A"/>
           <w:sz w:val="28"/>
         </w:rPr>
-        <w:t>Gesamt-Beleihungsauslauf: 48,9 %</w:t>
+        <w:t>Gesamt-Beleihungsauslauf: 45,9 %</w:t>
       </w:r>
     </w:p>
     <w:p>
@@ -1331,7 +1331,7 @@
           <w:b/>
           <w:sz w:val="21"/>
         </w:rPr>
-        <w:t xml:space="preserve">636.000 € freie Sicherheiten </w:t>
+        <w:t xml:space="preserve">676.000 € freie Sicherheiten </w:t>
       </w:r>
       <w:r>
         <w:rPr>
@@ -1356,7 +1356,7 @@
         <w:rPr>
           <w:sz w:val="21"/>
         </w:rPr>
-        <w:t>Wir möchten die freien Grundschuldanteile unserer Bestandsobjekte (EFH in Bünde + MFH in Herford) als Zusatzsicherheit einbringen, um die Eigenkapitalanforderung von 111.000 € zu reduzieren. Der Gesamt-Beleihungsauslauf bleibt mit unter 49 % auf einem sehr konservativen Niveau.</w:t>
+        <w:t>Wir möchten die freien Grundschuldanteile unserer Bestandsobjekte (EFH in Bünde + MFH in Herford) als Zusatzsicherheit einbringen, um die Eigenkapitalanforderung von 111.000 € zu reduzieren. Der Gesamt-Beleihungsauslauf bleibt mit unter 46 % auf einem sehr konservativen Niveau.</w:t>
       </w:r>
     </w:p>
     <w:p/>

</xml_diff>